<commit_message>
Paso W-2: Normalizar binarios de Semana 3 (FGAP030 Word/PDF, PPT de Presentacion y Diagrama de Arquitectura PDF)
</commit_message>
<xml_diff>
--- a/curso/semana-03-roles-y-prototipos/nuestras-entregas/FGAP030_Roles_y_Prototipos_NewBit/FGAP030_Roles_y_Prototipos_NewBit.docx
+++ b/curso/semana-03-roles-y-prototipos/nuestras-entregas/FGAP030_Roles_y_Prototipos_NewBit/FGAP030_Roles_y_Prototipos_NewBit.docx
@@ -356,21 +356,8 @@
             <w:vAlign w:val="center"/>
           </w:tcPr>
           <w:p>
-            <w:pPr>
-              <w:rPr/>
-            </w:pPr>
             <w:r>
-              <w:rPr>
-                <w:sz w:val="16"/>
-                <w:szCs w:val="16"/>
-                <w:rtl w:val="0"/>
-              </w:rPr>
-              <w:t xml:space="preserve">1.0</w:t>
-            </w:r>
-            <w:r>
-              <w:rPr>
-                <w:rtl w:val="0"/>
-              </w:rPr>
+              <w:t>2.0</w:t>
             </w:r>
           </w:p>
         </w:tc>
@@ -496,21 +483,8 @@
             <w:vAlign w:val="center"/>
           </w:tcPr>
           <w:p>
-            <w:pPr>
-              <w:rPr/>
-            </w:pPr>
             <w:r>
-              <w:rPr>
-                <w:sz w:val="16"/>
-                <w:szCs w:val="16"/>
-                <w:rtl w:val="0"/>
-              </w:rPr>
-              <w:t xml:space="preserve">12/10/2026</w:t>
-            </w:r>
-            <w:r>
-              <w:rPr>
-                <w:rtl w:val="0"/>
-              </w:rPr>
+              <w:t>17/10/2026</w:t>
             </w:r>
           </w:p>
         </w:tc>
@@ -531,21 +505,8 @@
             <w:vAlign w:val="center"/>
           </w:tcPr>
           <w:p>
-            <w:pPr>
-              <w:rPr/>
-            </w:pPr>
             <w:r>
-              <w:rPr>
-                <w:sz w:val="16"/>
-                <w:szCs w:val="16"/>
-                <w:rtl w:val="0"/>
-              </w:rPr>
-              <w:t xml:space="preserve">Emisión inicial de NewBit</w:t>
-            </w:r>
-            <w:r>
-              <w:rPr>
-                <w:rtl w:val="0"/>
-              </w:rPr>
+              <w:t>Normalización a manufactura metalmecánica y sincronización con el Backlog canónico</w:t>
             </w:r>
           </w:p>
         </w:tc>
@@ -646,14 +607,8 @@
             <w:vAlign w:val="center"/>
           </w:tcPr>
           <w:p>
-            <w:pPr>
-              <w:rPr/>
-            </w:pPr>
             <w:r>
-              <w:rPr>
-                <w:rtl w:val="0"/>
-              </w:rPr>
-              <w:t xml:space="preserve">PY-NB-001 – NewBit: plataforma de Computer Vision que convierte cámaras existentes en sensores inteligentes configurables para operaciones industriales</w:t>
+              <w:t>PY-NB-001 – Sistema web con Visión Artificial para la detección de actos inseguros en áreas operativas de manufactura metalmecánica (Nombre comercial: NewBit)</w:t>
             </w:r>
           </w:p>
         </w:tc>
@@ -683,19 +638,7 @@
         <w:rPr/>
       </w:pPr>
       <w:r>
-        <w:rPr>
-          <w:i w:val="1"/>
-          <w:iCs w:val="1"/>
-          <w:sz w:val="16"/>
-          <w:szCs w:val="16"/>
-          <w:rtl w:val="0"/>
-        </w:rPr>
-        <w:t xml:space="preserve">Perfiles ficticios para fines académicos (SIDERPERU como caso propuesto). La proficiencia indicada corresponde al uso esperado después de la capacitación inicial.</w:t>
-      </w:r>
-      <w:r>
-        <w:rPr>
-          <w:rtl w:val="0"/>
-        </w:rPr>
+        <w:t>Perfiles ficticios para fines académicos (taller de manufactura metalmecánica / mecanizado industrial como caso propuesto). La proficiencia indicada corresponde al uso esperado después de la capacitación inicial.</w:t>
       </w:r>
     </w:p>
     <w:p>
@@ -1145,22 +1088,8 @@
             <w:vAlign w:val="center"/>
           </w:tcPr>
           <w:p>
-            <w:pPr>
-              <w:rPr/>
-            </w:pPr>
             <w:r>
-              <w:rPr>
-                <w:b w:val="1"/>
-                <w:bCs w:val="1"/>
-                <w:rtl w:val="0"/>
-              </w:rPr>
-              <w:t xml:space="preserve">Jorge Ponce Aguilar. </w:t>
-            </w:r>
-            <w:r>
-              <w:rPr>
-                <w:rtl w:val="0"/>
-              </w:rPr>
-              <w:t xml:space="preserve">Jorge tiene 35 años y trabaja como analista de TI en SIDERPERU, en Nuevo Chimbote. Vive con su esposa y su hijo. Administra servidores, redes y el sistema de cámaras de la planta. Quiere que NewBit procese los videos sin intervención manual y que cualquier ajuste (umbral, conductas activas, usuarios) se haga desde la interfaz, sin tocar código. Valora los mensajes de error claros y un historial de cambios.</w:t>
+              <w:t>Jorge Ponce Aguilar. Jorge tiene 35 años y trabaja como analista de TI y sistemas en la empresa de manufactura metalmecánica, en Nuevo Chimbote. Vive con su esposa y su hijo. Administra servidores, redes y el sistema de cámaras de la planta. Quiere que NewBit procese los videos sin intervención manual y que cualquier ajuste (umbral, conductas activas, usuarios) se haga desde la interfaz, sin tocar código. Valora los mensajes de error claros y un historial de cambios.</w:t>
             </w:r>
           </w:p>
         </w:tc>
@@ -1602,22 +1531,8 @@
             <w:vAlign w:val="center"/>
           </w:tcPr>
           <w:p>
-            <w:pPr>
-              <w:rPr/>
-            </w:pPr>
             <w:r>
-              <w:rPr>
-                <w:b w:val="1"/>
-                <w:bCs w:val="1"/>
-                <w:rtl w:val="0"/>
-              </w:rPr>
-              <w:t xml:space="preserve">Mariana Torres Cárdenas. </w:t>
-            </w:r>
-            <w:r>
-              <w:rPr>
-                <w:rtl w:val="0"/>
-              </w:rPr>
-              <w:t xml:space="preserve">Mariana tiene 32 años y es supervisora de SST en SIDERPERU. Vive en Chimbote con su pareja y su hija. Reparte su día entre recorridos de planta y reportes, y maneja hojas de cálculo y procedimientos de seguridad. Quiere enterarse de una conducta insegura cuando todavía puede intervenir y saber en qué zonas se repite, sin revisar horas de video. Necesita alertas claras, clips cortos de evidencia y filtros simples.</w:t>
+              <w:t>Mariana Torres Cárdenas. Mariana tiene 32 años y es supervisora de SST en la planta de manufactura metalmecánica. Vive en Chimbote con su pareja y su hija. Reparte su día entre recorridos de planta y reportes, y maneja hojas de cálculo y procedimientos de seguridad. Quiere enterarse de una conducta insegura cuando todavía puede intervenir y saber en qué zonas se repite, sin revisar horas de video. Necesita alertas claras, clips cortos de evidencia y filtros simples.</w:t>
             </w:r>
           </w:p>
         </w:tc>
@@ -2197,22 +2112,8 @@
             <w:vAlign w:val="center"/>
           </w:tcPr>
           <w:p>
-            <w:pPr>
-              <w:rPr/>
-            </w:pPr>
             <w:r>
-              <w:rPr>
-                <w:b w:val="1"/>
-                <w:bCs w:val="1"/>
-                <w:rtl w:val="0"/>
-              </w:rPr>
-              <w:t xml:space="preserve">FRECUENCIA DE USO DEL PRODUCTO: </w:t>
-            </w:r>
-            <w:r>
-              <w:rPr>
-                <w:rtl w:val="0"/>
-              </w:rPr>
-              <w:t xml:space="preserve">Permanente durante su turno: atiende las alertas en tiempo real.</w:t>
+              <w:t>FRECUENCIA DE USO DEL PRODUCTO: Permanente durante su turno: atiende y procesa las alertas generadas por los videos en lote.</w:t>
             </w:r>
           </w:p>
         </w:tc>
@@ -2529,22 +2430,8 @@
             <w:vAlign w:val="center"/>
           </w:tcPr>
           <w:p>
-            <w:pPr>
-              <w:rPr/>
-            </w:pPr>
             <w:r>
-              <w:rPr>
-                <w:b w:val="1"/>
-                <w:bCs w:val="1"/>
-                <w:rtl w:val="0"/>
-              </w:rPr>
-              <w:t xml:space="preserve">Lucía Ramos Villena. </w:t>
-            </w:r>
-            <w:r>
-              <w:rPr>
-                <w:rtl w:val="0"/>
-              </w:rPr>
-              <w:t xml:space="preserve">Lucía tiene 29 años y es operadora de la central de monitoreo de SIDERPERU. Es técnica en computación, vive sola en Nuevo Chimbote y estudia inglés por las noches. Hoy vigila muchas cámaras a la vez y sabe que es fácil pasar algo por alto. Quiere que NewBit le señale solo lo importante, con una alerta que no pueda ignorar y un botón para confirmar o descartar en un clic.</w:t>
+              <w:t>Lucía Ramos Villena. Lucía tiene 29 años y es operadora de monitoreo y procesamiento de video en lote de la empresa metalmecánica. Es técnica en computación, vive sola en Nuevo Chimbote y estudia inglés por las noches. Hoy vigila muchas cámaras a la vez y sabe que es fácil pasar algo por alto. Quiere que NewBit le señale solo lo importante, con una alerta que no pueda ignorar y un botón para confirmar o descartar en un clic.</w:t>
             </w:r>
           </w:p>
         </w:tc>
@@ -2986,22 +2873,8 @@
             <w:vAlign w:val="center"/>
           </w:tcPr>
           <w:p>
-            <w:pPr>
-              <w:rPr/>
-            </w:pPr>
             <w:r>
-              <w:rPr>
-                <w:b w:val="1"/>
-                <w:bCs w:val="1"/>
-                <w:rtl w:val="0"/>
-              </w:rPr>
-              <w:t xml:space="preserve">Ricardo Salcedo Paredes. </w:t>
-            </w:r>
-            <w:r>
-              <w:rPr>
-                <w:rtl w:val="0"/>
-              </w:rPr>
-              <w:t xml:space="preserve">Ricardo tiene 48 años, es gerente de operaciones de SIDERPERU y es el sponsor del proyecto. Está casado y tiene dos hijos universitarios. Divide su semana entre reuniones de producción y visitas a planta. No quiere configurar nada ni revisar alertas una por una: busca cifras claras que le digan si las conductas inseguras disminuyen y dónde conviene invertir.</w:t>
+              <w:t>Ricardo Salcedo Paredes. Ricardo tiene 48 años, es Gerente General de la empresa de manufactura metalmecánica y sponsor del proyecto. Está casado y tiene dos hijos universitarios. Divide su semana entre reuniones de producción y visitas a planta. No quiere configurar nada ni revisar alertas una por una: busca cifras claras que le digan si las conductas inseguras disminuyen y dónde conviene invertir.</w:t>
             </w:r>
           </w:p>
         </w:tc>

</xml_diff>